<commit_message>
Merkblätter geändert - mit Änderungsverfolgung
</commit_message>
<xml_diff>
--- a/Merkblätter/Merkblatt_Aufsichtspersonen_KB_allgemein.docx
+++ b/Merkblätter/Merkblatt_Aufsichtspersonen_KB_allgemein.docx
@@ -34,15 +34,58 @@
           <w:i/>
           <w:iCs/>
         </w:rPr>
-        <w:t>Version 1 – 202</w:t>
+        <w:t xml:space="preserve">Version </w:t>
+      </w:r>
+      <w:del w:id="0" w:author="Gottfried Zimmermann" w:date="2026-06-26T15:54:00Z" w16du:dateUtc="2026-06-26T13:54:00Z">
+        <w:r>
+          <w:rPr>
+            <w:i/>
+            <w:iCs/>
+          </w:rPr>
+          <w:delText>1</w:delText>
+        </w:r>
+      </w:del>
+      <w:ins w:id="1" w:author="Gottfried Zimmermann" w:date="2026-06-26T15:54:00Z" w16du:dateUtc="2026-06-26T13:54:00Z">
+        <w:r>
+          <w:rPr>
+            <w:i/>
+            <w:iCs/>
+          </w:rPr>
+          <w:t>2</w:t>
+        </w:r>
+      </w:ins>
+      <w:r>
+        <w:rPr>
+          <w:i/>
+          <w:iCs/>
+        </w:rPr>
+        <w:t xml:space="preserve"> – 202</w:t>
       </w:r>
       <w:r>
         <w:rPr>
           <w:i/>
           <w:iCs/>
         </w:rPr>
-        <w:t>6-03-09</w:t>
+        <w:t>6-0</w:t>
       </w:r>
+      <w:ins w:id="2" w:author="Gottfried Zimmermann" w:date="2026-06-26T15:54:00Z" w16du:dateUtc="2026-06-26T13:54:00Z">
+        <w:r>
+          <w:rPr>
+            <w:i/>
+            <w:iCs/>
+          </w:rPr>
+          <w:t>6-26</w:t>
+        </w:r>
+      </w:ins>
+      <w:del w:id="3" w:author="Gottfried Zimmermann" w:date="2026-06-26T15:54:00Z" w16du:dateUtc="2026-06-26T13:54:00Z">
+        <w:r>
+          <w:rPr>
+            <w:i/>
+            <w:iCs/>
+          </w:rPr>
+          <w:delText>3-09</w:delText>
+        </w:r>
+      </w:del>
     </w:p>
     <w:p>
       <w:r>
@@ -138,7 +181,21 @@
         <w:rPr>
           <w:lang w:bidi="th-TH"/>
         </w:rPr>
-        <w:t>selbst das Knowledge Badge</w:t>
+        <w:t xml:space="preserve">selbst das </w:t>
+      </w:r>
+      <w:ins w:id="4" w:author="Gottfried Zimmermann" w:date="2026-06-26T15:55:00Z" w16du:dateUtc="2026-06-26T13:55:00Z">
+        <w:r>
+          <w:rPr>
+            <w:lang w:bidi="th-TH"/>
+          </w:rPr>
+          <w:t xml:space="preserve">entsprechende </w:t>
+        </w:r>
+      </w:ins>
+      <w:r>
+        <w:rPr>
+          <w:lang w:bidi="th-TH"/>
+        </w:rPr>
+        <w:t>Knowledge Badge</w:t>
       </w:r>
       <w:r>
         <w:rPr>
@@ -186,7 +243,29 @@
         <w:rPr>
           <w:lang w:bidi="th-TH"/>
         </w:rPr>
-        <w:t>Knowledge Badge-</w:t>
+        <w:t>Knowledge</w:t>
+      </w:r>
+      <w:ins w:id="5" w:author="Gottfried Zimmermann" w:date="2026-06-26T15:55:00Z" w16du:dateUtc="2026-06-26T13:55:00Z">
+        <w:r>
+          <w:rPr>
+            <w:lang w:bidi="th-TH"/>
+          </w:rPr>
+          <w:t>-</w:t>
+        </w:r>
+      </w:ins>
+      <w:del w:id="6" w:author="Gottfried Zimmermann" w:date="2026-06-26T15:55:00Z" w16du:dateUtc="2026-06-26T13:55:00Z">
+        <w:r>
+          <w:rPr>
+            <w:lang w:bidi="th-TH"/>
+          </w:rPr>
+          <w:delText xml:space="preserve"> </w:delText>
+        </w:r>
+      </w:del>
+      <w:r>
+        <w:rPr>
+          <w:lang w:bidi="th-TH"/>
+        </w:rPr>
+        <w:t>Badge-</w:t>
       </w:r>
       <w:r>
         <w:rPr>
@@ -303,11 +382,67 @@
         </w:rPr>
         <w:t xml:space="preserve"> (kostenlose Registrierung)</w:t>
       </w:r>
+      <w:ins w:id="7" w:author="Gottfried Zimmermann" w:date="2026-06-26T15:55:00Z" w16du:dateUtc="2026-06-26T13:55:00Z">
+        <w:r>
+          <w:rPr>
+            <w:rFonts w:eastAsia="Calibri"/>
+            <w:szCs w:val="28"/>
+            <w:lang w:bidi="th-TH"/>
+          </w:rPr>
+          <w:t>. Die zentrale Prüfungsadministration wird Sie als „Aufsichtsperso</w:t>
+        </w:r>
+      </w:ins>
+      <w:ins w:id="8" w:author="Gottfried Zimmermann" w:date="2026-06-26T15:56:00Z" w16du:dateUtc="2026-06-26T13:56:00Z">
+        <w:r>
+          <w:rPr>
+            <w:rFonts w:eastAsia="Calibri"/>
+            <w:szCs w:val="28"/>
+            <w:lang w:bidi="th-TH"/>
+          </w:rPr>
+          <w:t>n“ einschreiben.</w:t>
+        </w:r>
+      </w:ins>
       <w:r>
         <w:rPr>
           <w:lang w:bidi="th-TH"/>
         </w:rPr>
-        <w:t xml:space="preserve"> und lassen Sie sich eine Einweisung und Admin-Rechte für den Examenskurs geben.</w:t>
+        <w:t xml:space="preserve"> </w:t>
+      </w:r>
+      <w:del w:id="9" w:author="Gottfried Zimmermann" w:date="2026-06-26T15:56:00Z" w16du:dateUtc="2026-06-26T13:56:00Z">
+        <w:r>
+          <w:rPr>
+            <w:lang w:bidi="th-TH"/>
+          </w:rPr>
+          <w:delText>und l</w:delText>
+        </w:r>
+      </w:del>
+      <w:ins w:id="10" w:author="Gottfried Zimmermann" w:date="2026-06-26T15:56:00Z" w16du:dateUtc="2026-06-26T13:56:00Z">
+        <w:r>
+          <w:rPr>
+            <w:lang w:bidi="th-TH"/>
+          </w:rPr>
+          <w:t>L</w:t>
+        </w:r>
+      </w:ins>
+      <w:r>
+        <w:rPr>
+          <w:lang w:bidi="th-TH"/>
+        </w:rPr>
+        <w:t xml:space="preserve">assen Sie sich eine Einweisung </w:t>
+      </w:r>
+      <w:del w:id="11" w:author="Gottfried Zimmermann" w:date="2026-06-26T15:56:00Z" w16du:dateUtc="2026-06-26T13:56:00Z">
+        <w:r>
+          <w:rPr>
+            <w:lang w:bidi="th-TH"/>
+          </w:rPr>
+          <w:delText xml:space="preserve">und Admin-Rechte </w:delText>
+        </w:r>
+      </w:del>
+      <w:r>
+        <w:rPr>
+          <w:lang w:bidi="th-TH"/>
+        </w:rPr>
+        <w:t>für den Examenskurs geben.</w:t>
       </w:r>
     </w:p>
     <w:p>
@@ -361,21 +496,7 @@
         <w:rPr>
           <w:lang w:bidi="th-TH"/>
         </w:rPr>
-        <w:t xml:space="preserve">Namen und </w:t>
-      </w:r>
-      <w:proofErr w:type="gramStart"/>
-      <w:r>
-        <w:rPr>
-          <w:lang w:bidi="th-TH"/>
-        </w:rPr>
-        <w:t>Email</w:t>
-      </w:r>
-      <w:proofErr w:type="gramEnd"/>
-      <w:r>
-        <w:rPr>
-          <w:lang w:bidi="th-TH"/>
-        </w:rPr>
-        <w:t>-Adressen der Prüflinge</w:t>
+        <w:t>Namen und Email-Adressen der Prüflinge</w:t>
       </w:r>
     </w:p>
     <w:p>
@@ -440,11 +561,11 @@
           <w:numId w:val="5"/>
         </w:numPr>
       </w:pPr>
-      <w:bookmarkStart w:id="0" w:name="_Hlk208997530"/>
+      <w:bookmarkStart w:id="12" w:name="_Hlk208997530"/>
       <w:r>
         <w:t>Ggf. benötigte Ausstattung vor Ort (externer Bildschirm, Laptop, etc.).</w:t>
       </w:r>
-      <w:bookmarkEnd w:id="0"/>
+      <w:bookmarkEnd w:id="12"/>
     </w:p>
     <w:p>
       <w:pPr>
@@ -482,13 +603,26 @@
           <w:ilvl w:val="1"/>
           <w:numId w:val="5"/>
         </w:numPr>
-      </w:pPr>
-      <w:r>
-        <w:rPr>
-          <w:lang w:bidi="th-TH"/>
-        </w:rPr>
-        <w:t>Passwort für die Prüfung</w:t>
-      </w:r>
+        <w:rPr>
+          <w:del w:id="13" w:author="Gottfried Zimmermann" w:date="2026-06-26T15:57:00Z" w16du:dateUtc="2026-06-26T13:57:00Z"/>
+        </w:rPr>
+      </w:pPr>
+      <w:ins w:id="14" w:author="Gottfried Zimmermann" w:date="2026-06-26T15:57:00Z" w16du:dateUtc="2026-06-26T13:57:00Z">
+        <w:r>
+          <w:rPr>
+            <w:lang w:bidi="th-TH"/>
+          </w:rPr>
+          <w:t xml:space="preserve">Spezifischer </w:t>
+        </w:r>
+      </w:ins>
+      <w:del w:id="15" w:author="Gottfried Zimmermann" w:date="2026-06-26T15:57:00Z" w16du:dateUtc="2026-06-26T13:57:00Z">
+        <w:r>
+          <w:rPr>
+            <w:lang w:bidi="th-TH"/>
+          </w:rPr>
+          <w:delText>Passwort für die Prüfung</w:delText>
+        </w:r>
+      </w:del>
     </w:p>
     <w:p>
       <w:pPr>
@@ -504,6 +638,14 @@
         </w:rPr>
         <w:t>Einschreibeschlüssel</w:t>
       </w:r>
+      <w:ins w:id="16" w:author="Gottfried Zimmermann" w:date="2026-06-26T15:57:00Z" w16du:dateUtc="2026-06-26T13:57:00Z">
+        <w:r>
+          <w:rPr>
+            <w:lang w:bidi="th-TH"/>
+          </w:rPr>
+          <w:t xml:space="preserve"> für Ihren Prüfungstermin</w:t>
+        </w:r>
+      </w:ins>
     </w:p>
     <w:p>
       <w:pPr>
@@ -658,36 +800,39 @@
           <w:numId w:val="5"/>
         </w:numPr>
         <w:rPr>
+          <w:del w:id="17" w:author="Gottfried Zimmermann" w:date="2026-06-26T15:58:00Z" w16du:dateUtc="2026-06-26T13:58:00Z"/>
           <w:lang w:bidi="th-TH"/>
         </w:rPr>
       </w:pPr>
-      <w:r>
-        <w:rPr>
-          <w:lang w:bidi="th-TH"/>
-        </w:rPr>
-        <w:t>Am Tag der Prüfung finden Sie das Passwort für die Prüfung im Examenskurs. Wichtig:</w:t>
-      </w:r>
-      <w:r>
-        <w:t xml:space="preserve"> </w:t>
-      </w:r>
-      <w:r>
-        <w:rPr>
-          <w:lang w:bidi="th-TH"/>
-        </w:rPr>
-        <w:t xml:space="preserve">Das Passwort wird nach jeder Prüfung geändert! </w:t>
-      </w:r>
-      <w:r>
-        <w:rPr>
-          <w:lang w:bidi="th-TH"/>
-        </w:rPr>
-        <w:t>Das neue Passwort ist nur während dem Prüfungszeitraum aktiv. B</w:t>
-      </w:r>
-      <w:r>
-        <w:rPr>
-          <w:lang w:bidi="th-TH"/>
-        </w:rPr>
-        <w:t xml:space="preserve">itte prüfen Sie rechtzeitig vor Ihrem Prüfungstermin, ob Sie die aktuelle Version haben. </w:t>
-      </w:r>
+      <w:del w:id="18" w:author="Gottfried Zimmermann" w:date="2026-06-26T15:58:00Z" w16du:dateUtc="2026-06-26T13:58:00Z">
+        <w:r>
+          <w:rPr>
+            <w:lang w:bidi="th-TH"/>
+          </w:rPr>
+          <w:delText>Am Tag der Prüfung finden Sie das Passwort für die Prüfung im Examenskurs. Wichtig:</w:delText>
+        </w:r>
+        <w:r>
+          <w:delText xml:space="preserve"> </w:delText>
+        </w:r>
+        <w:r>
+          <w:rPr>
+            <w:lang w:bidi="th-TH"/>
+          </w:rPr>
+          <w:delText xml:space="preserve">Das Passwort wird nach jeder Prüfung geändert! </w:delText>
+        </w:r>
+        <w:r>
+          <w:rPr>
+            <w:lang w:bidi="th-TH"/>
+          </w:rPr>
+          <w:delText>Das neue Passwort ist nur während dem Prüfungszeitraum aktiv. B</w:delText>
+        </w:r>
+        <w:r>
+          <w:rPr>
+            <w:lang w:bidi="th-TH"/>
+          </w:rPr>
+          <w:delText xml:space="preserve">itte prüfen Sie rechtzeitig vor Ihrem Prüfungstermin, ob Sie die aktuelle Version haben. </w:delText>
+        </w:r>
+      </w:del>
     </w:p>
     <w:p>
       <w:pPr>
@@ -703,11 +848,21 @@
       <w:r>
         <w:t xml:space="preserve">Lesen Sie sich das Merkblatt für Nachteilsausgleiche sowie die Schritt-für-Schritt-Anleitung zum </w:t>
       </w:r>
+      <w:del w:id="19" w:author="Gottfried Zimmermann" w:date="2026-06-26T15:58:00Z" w16du:dateUtc="2026-06-26T13:58:00Z">
+        <w:r>
+          <w:delText>Einstellen</w:delText>
+        </w:r>
+        <w:r>
+          <w:delText xml:space="preserve"> der</w:delText>
+        </w:r>
+      </w:del>
+      <w:ins w:id="20" w:author="Gottfried Zimmermann" w:date="2026-06-26T15:58:00Z" w16du:dateUtc="2026-06-26T13:58:00Z">
+        <w:r>
+          <w:t>Erstellen einer</w:t>
+        </w:r>
+      </w:ins>
       <w:r>
-        <w:t>Einstellen</w:t>
-      </w:r>
-      <w:r>
-        <w:t xml:space="preserve"> der Zeitverlängerung </w:t>
+        <w:t xml:space="preserve"> Zeitverlängerung </w:t>
       </w:r>
       <w:r>
         <w:t xml:space="preserve">im Examenskurs </w:t>
@@ -787,8 +942,32 @@
         <w:rPr>
           <w:lang w:bidi="th-TH"/>
         </w:rPr>
-        <w:t>Bei einem Antrag auf Nachteilsausgleich den entsprechenden Nachweis einholen und die Zeitverlängerung im Examenskurs einrichten.</w:t>
+        <w:t>Bei einem Antrag auf Nachteilsausgleich den entsprechenden Nachweis einholen</w:t>
       </w:r>
+      <w:ins w:id="21" w:author="Gottfried Zimmermann" w:date="2026-06-26T15:59:00Z" w16du:dateUtc="2026-06-26T13:59:00Z">
+        <w:r>
+          <w:rPr>
+            <w:lang w:bidi="th-TH"/>
+          </w:rPr>
+          <w:t>.</w:t>
+        </w:r>
+      </w:ins>
+      <w:r>
+        <w:rPr>
+          <w:lang w:bidi="th-TH"/>
+        </w:rPr>
+        <w:t xml:space="preserve"> </w:t>
+      </w:r>
+      <w:moveFromRangeStart w:id="22" w:author="Gottfried Zimmermann" w:date="2026-06-26T15:59:00Z" w:name="move233382005"/>
+      <w:moveFrom w:id="23" w:author="Gottfried Zimmermann" w:date="2026-06-26T15:59:00Z" w16du:dateUtc="2026-06-26T13:59:00Z">
+        <w:r>
+          <w:rPr>
+            <w:lang w:bidi="th-TH"/>
+          </w:rPr>
+          <w:t>und die Zeitverlängerung im Examenskurs einrichten.</w:t>
+        </w:r>
+      </w:moveFrom>
+      <w:moveFromRangeEnd w:id="22"/>
     </w:p>
     <w:p>
       <w:pPr>
@@ -913,7 +1092,6 @@
         <w:rPr>
           <w:lang w:bidi="th-TH"/>
         </w:rPr>
-        <w:lastRenderedPageBreak/>
         <w:t>Sicherstellen, dass Prüflinge mit Screenreader Kopfhörer verwenden.</w:t>
       </w:r>
     </w:p>
@@ -961,6 +1139,15 @@
           <w:numId w:val="8"/>
         </w:numPr>
       </w:pPr>
+      <w:ins w:id="24" w:author="Gottfried Zimmermann" w:date="2026-06-26T15:59:00Z" w16du:dateUtc="2026-06-26T13:59:00Z">
+        <w:r>
+          <w:rPr>
+            <w:szCs w:val="28"/>
+            <w:lang w:bidi="th-TH"/>
+          </w:rPr>
+          <w:t xml:space="preserve">Link und </w:t>
+        </w:r>
+      </w:ins>
       <w:r>
         <w:rPr>
           <w:szCs w:val="28"/>
@@ -1004,6 +1191,7 @@
         <w:rPr>
           <w:lang w:bidi="th-TH"/>
         </w:rPr>
+        <w:lastRenderedPageBreak/>
         <w:t>Alle Prüflinge in den Examens-Kurs eintreten lassen.</w:t>
       </w:r>
     </w:p>
@@ -1014,6 +1202,9 @@
           <w:ilvl w:val="0"/>
           <w:numId w:val="8"/>
         </w:numPr>
+        <w:rPr>
+          <w:ins w:id="25" w:author="Gottfried Zimmermann" w:date="2026-06-26T15:59:00Z" w16du:dateUtc="2026-06-26T13:59:00Z"/>
+        </w:rPr>
       </w:pPr>
       <w:r>
         <w:rPr>
@@ -1051,6 +1242,57 @@
         </w:rPr>
         <w:t>.</w:t>
       </w:r>
+    </w:p>
+    <w:p>
+      <w:pPr>
+        <w:pStyle w:val="Listenabsatz"/>
+        <w:numPr>
+          <w:ilvl w:val="0"/>
+          <w:numId w:val="8"/>
+        </w:numPr>
+      </w:pPr>
+      <w:moveToRangeStart w:id="26" w:author="Gottfried Zimmermann" w:date="2026-06-26T15:59:00Z" w:name="move233382005"/>
+      <w:moveTo w:id="27" w:author="Gottfried Zimmermann" w:date="2026-06-26T15:59:00Z" w16du:dateUtc="2026-06-26T13:59:00Z">
+        <w:del w:id="28" w:author="Gottfried Zimmermann" w:date="2026-06-26T16:00:00Z" w16du:dateUtc="2026-06-26T14:00:00Z">
+          <w:r>
+            <w:rPr>
+              <w:lang w:bidi="th-TH"/>
+            </w:rPr>
+            <w:delText xml:space="preserve">und die </w:delText>
+          </w:r>
+        </w:del>
+        <w:r>
+          <w:rPr>
+            <w:lang w:bidi="th-TH"/>
+          </w:rPr>
+          <w:t>Zeitverlängerung</w:t>
+        </w:r>
+      </w:moveTo>
+      <w:ins w:id="29" w:author="Gottfried Zimmermann" w:date="2026-06-26T16:00:00Z" w16du:dateUtc="2026-06-26T14:00:00Z">
+        <w:r>
+          <w:rPr>
+            <w:lang w:bidi="th-TH"/>
+          </w:rPr>
+          <w:t>en für Nachteilsausgleiche</w:t>
+        </w:r>
+      </w:ins>
+      <w:moveTo w:id="30" w:author="Gottfried Zimmermann" w:date="2026-06-26T15:59:00Z" w16du:dateUtc="2026-06-26T13:59:00Z">
+        <w:r>
+          <w:rPr>
+            <w:lang w:bidi="th-TH"/>
+          </w:rPr>
+          <w:t xml:space="preserve"> im Examenskurs einrichten.</w:t>
+        </w:r>
+      </w:moveTo>
+      <w:moveToRangeEnd w:id="26"/>
+      <w:ins w:id="31" w:author="Gottfried Zimmermann" w:date="2026-06-26T16:00:00Z" w16du:dateUtc="2026-06-26T14:00:00Z">
+        <w:r>
+          <w:rPr>
+            <w:lang w:bidi="th-TH"/>
+          </w:rPr>
+          <w:t xml:space="preserve"> Hinweis: Das geht erst, nachdem die entsprechenden Personen dem Examenskurs beigetreten sind.</w:t>
+        </w:r>
+      </w:ins>
     </w:p>
     <w:p>
       <w:pPr>
@@ -1092,6 +1334,7 @@
           <w:numId w:val="9"/>
         </w:numPr>
         <w:rPr>
+          <w:ins w:id="32" w:author="Gottfried Zimmermann" w:date="2026-06-26T16:02:00Z" w16du:dateUtc="2026-06-26T14:02:00Z"/>
           <w:lang w:bidi="th-TH"/>
         </w:rPr>
       </w:pPr>
@@ -1113,6 +1356,42 @@
           <w:lang w:bidi="th-TH"/>
         </w:rPr>
       </w:pPr>
+      <w:ins w:id="33" w:author="Gottfried Zimmermann" w:date="2026-06-26T16:02:00Z" w16du:dateUtc="2026-06-26T14:02:00Z">
+        <w:r>
+          <w:rPr>
+            <w:lang w:bidi="th-TH"/>
+          </w:rPr>
+          <w:t>Wenn Sie einen Prüfling beim Betrug erwischen (unerlaubte Hilfsmittel, Abschreiben von anderen Prüflingen), ord</w:t>
+        </w:r>
+      </w:ins>
+      <w:ins w:id="34" w:author="Gottfried Zimmermann" w:date="2026-06-26T16:03:00Z" w16du:dateUtc="2026-06-26T14:03:00Z">
+        <w:r>
+          <w:rPr>
+            <w:lang w:bidi="th-TH"/>
+          </w:rPr>
+          <w:t>nen Sie diesen der Gruppe „Betrugsversuch“ zu. Hinweis: Im Examenskurs die Teilnehmerliste anzeigen lassen, dann bei der Person die Gruppe „Betrugsversuch“ einstellen. Ab dann kann diese Person nicht mehr auf das Examen und</w:t>
+        </w:r>
+      </w:ins>
+      <w:ins w:id="35" w:author="Gottfried Zimmermann" w:date="2026-06-26T16:04:00Z" w16du:dateUtc="2026-06-26T14:04:00Z">
+        <w:r>
+          <w:rPr>
+            <w:lang w:bidi="th-TH"/>
+          </w:rPr>
+          <w:t xml:space="preserve"> auf das Kurszertifikat zugreifen. </w:t>
+        </w:r>
+      </w:ins>
+    </w:p>
+    <w:p>
+      <w:pPr>
+        <w:pStyle w:val="Listenabsatz"/>
+        <w:numPr>
+          <w:ilvl w:val="0"/>
+          <w:numId w:val="9"/>
+        </w:numPr>
+        <w:rPr>
+          <w:lang w:bidi="th-TH"/>
+        </w:rPr>
+      </w:pPr>
       <w:r>
         <w:rPr>
           <w:lang w:bidi="th-TH"/>
@@ -1250,15 +1529,18 @@
           <w:numId w:val="10"/>
         </w:numPr>
         <w:rPr>
+          <w:del w:id="36" w:author="Gottfried Zimmermann" w:date="2026-06-26T16:01:00Z" w16du:dateUtc="2026-06-26T14:01:00Z"/>
           <w:lang w:bidi="th-TH"/>
         </w:rPr>
       </w:pPr>
-      <w:r>
-        <w:rPr>
-          <w:lang w:bidi="th-TH"/>
-        </w:rPr>
-        <w:t>Nach Ablauf der Zeit alle Prüflinge auffordern, die elektronische Prüfung abzuschließen (ABSENDEN-Button).</w:t>
-      </w:r>
+      <w:del w:id="37" w:author="Gottfried Zimmermann" w:date="2026-06-26T16:01:00Z" w16du:dateUtc="2026-06-26T14:01:00Z">
+        <w:r>
+          <w:rPr>
+            <w:lang w:bidi="th-TH"/>
+          </w:rPr>
+          <w:delText>Nach Ablauf der Zeit alle Prüflinge auffordern, die elektronische Prüfung abzuschließen (ABSENDEN-Button).</w:delText>
+        </w:r>
+      </w:del>
     </w:p>
     <w:p>
       <w:pPr>
@@ -1302,21 +1584,7 @@
         <w:rPr>
           <w:lang w:bidi="th-TH"/>
         </w:rPr>
-        <w:t xml:space="preserve">Unterschriebene Teilnahmeliste und Protokollblatt einscannen und per </w:t>
-      </w:r>
-      <w:proofErr w:type="gramStart"/>
-      <w:r>
-        <w:rPr>
-          <w:lang w:bidi="th-TH"/>
-        </w:rPr>
-        <w:t>Email</w:t>
-      </w:r>
-      <w:proofErr w:type="gramEnd"/>
-      <w:r>
-        <w:rPr>
-          <w:lang w:bidi="th-TH"/>
-        </w:rPr>
-        <w:t xml:space="preserve"> an </w:t>
+        <w:t xml:space="preserve">Unterschriebene Teilnahmeliste und Protokollblatt einscannen und per Email an </w:t>
       </w:r>
       <w:r>
         <w:rPr>
@@ -1449,6 +1717,14 @@
         </w:rPr>
         <w:t>.</w:t>
       </w:r>
+      <w:ins w:id="38" w:author="Gottfried Zimmermann" w:date="2026-06-26T16:01:00Z" w16du:dateUtc="2026-06-26T14:01:00Z">
+        <w:r>
+          <w:rPr>
+            <w:lang w:bidi="th-TH"/>
+          </w:rPr>
+          <w:t xml:space="preserve"> </w:t>
+        </w:r>
+      </w:ins>
     </w:p>
     <w:p>
       <w:pPr>
@@ -3057,6 +3333,14 @@
     <w:abstractNumId w:val="5"/>
   </w:num>
 </w:numbering>
+</file>
+
+<file path=word/people.xml><?xml version="1.0" encoding="utf-8"?>
+<w15:people xmlns:wpc="http://schemas.microsoft.com/office/word/2010/wordprocessingCanvas" xmlns:cx="http://schemas.microsoft.com/office/drawing/2014/chartex" xmlns:cx1="http://schemas.microsoft.com/office/drawing/2015/9/8/chartex" xmlns:cx2="http://schemas.microsoft.com/office/drawing/2015/10/21/chartex" xmlns:cx3="http://schemas.microsoft.com/office/drawing/2016/5/9/chartex" xmlns:cx4="http://schemas.microsoft.com/office/drawing/2016/5/10/chartex" xmlns:cx5="http://schemas.microsoft.com/office/drawing/2016/5/11/chartex" xmlns:cx6="http://schemas.microsoft.com/office/drawing/2016/5/12/chartex" xmlns:cx7="http://schemas.microsoft.com/office/drawing/2016/5/13/chartex" xmlns:cx8="http://schemas.microsoft.com/office/drawing/2016/5/14/chartex" xmlns:mc="http://schemas.openxmlformats.org/markup-compatibility/2006" xmlns:aink="http://schemas.microsoft.com/office/drawing/2016/ink" xmlns:am3d="http://schemas.microsoft.com/office/drawing/2017/model3d" xmlns:o="urn:schemas-microsoft-com:office:office" xmlns:oel="http://schemas.microsoft.com/office/2019/extlst" xmlns:r="http://schemas.openxmlformats.org/officeDocument/2006/relationships" xmlns:m="http://schemas.openxmlformats.org/officeDocument/2006/math" xmlns:v="urn:schemas-microsoft-com:vml" xmlns:wp14="http://schemas.microsoft.com/office/word/2010/wordprocessingDrawing" xmlns:wp="http://schemas.openxmlformats.org/drawingml/2006/wordprocessingDrawing" xmlns:w10="urn:schemas-microsoft-com:office:word" xmlns:w="http://schemas.openxmlformats.org/wordprocessingml/2006/main" xmlns:w14="http://schemas.microsoft.com/office/word/2010/wordml" xmlns:w15="http://schemas.microsoft.com/office/word/2012/wordml" xmlns:w16cex="http://schemas.microsoft.com/office/word/2018/wordml/cex" xmlns:w16cid="http://schemas.microsoft.com/office/word/2016/wordml/cid" xmlns:w16="http://schemas.microsoft.com/office/word/2018/wordml" xmlns:w16du="http://schemas.microsoft.com/office/word/2023/wordml/word16du" xmlns:w16sdtdh="http://schemas.microsoft.com/office/word/2020/wordml/sdtdatahash" xmlns:w16sdtfl="http://schemas.microsoft.com/office/word/2024/wordml/sdtformatlock" xmlns:w16se="http://schemas.microsoft.com/office/word/2015/wordml/symex" xmlns:wpg="http://schemas.microsoft.com/office/word/2010/wordprocessingGroup" xmlns:wpi="http://schemas.microsoft.com/office/word/2010/wordprocessingInk" xmlns:wne="http://schemas.microsoft.com/office/word/2006/wordml" xmlns:wps="http://schemas.microsoft.com/office/word/2010/wordprocessingShape" mc:Ignorable="w14 w15 w16se w16cid w16 w16cex w16sdtdh w16sdtfl w16du wp14">
+  <w15:person w15:author="Gottfried Zimmermann">
+    <w15:presenceInfo w15:providerId="Windows Live" w15:userId="89dddc6042953ddf"/>
+  </w15:person>
+</w15:people>
 </file>
 
 <file path=word/styles.xml><?xml version="1.0" encoding="utf-8"?>

</xml_diff>

<commit_message>
Aktualisierte Merkblätter - clean
</commit_message>
<xml_diff>
--- a/Merkblätter/Merkblatt_Aufsichtspersonen_KB_allgemein.docx
+++ b/Merkblätter/Merkblatt_Aufsichtspersonen_KB_allgemein.docx
@@ -36,24 +36,13 @@
         </w:rPr>
         <w:t xml:space="preserve">Version </w:t>
       </w:r>
-      <w:del w:id="0" w:author="Gottfried Zimmermann" w:date="2026-06-26T15:54:00Z" w16du:dateUtc="2026-06-26T13:54:00Z">
-        <w:r>
-          <w:rPr>
-            <w:i/>
-            <w:iCs/>
-          </w:rPr>
-          <w:delText>1</w:delText>
-        </w:r>
-      </w:del>
-      <w:ins w:id="1" w:author="Gottfried Zimmermann" w:date="2026-06-26T15:54:00Z" w16du:dateUtc="2026-06-26T13:54:00Z">
-        <w:r>
-          <w:rPr>
-            <w:i/>
-            <w:iCs/>
-          </w:rPr>
-          <w:t>2</w:t>
-        </w:r>
-      </w:ins>
+      <w:r>
+        <w:rPr>
+          <w:i/>
+          <w:iCs/>
+        </w:rPr>
+        <w:t>2</w:t>
+      </w:r>
       <w:r>
         <w:rPr>
           <w:i/>
@@ -68,24 +57,13 @@
         </w:rPr>
         <w:t>6-0</w:t>
       </w:r>
-      <w:ins w:id="2" w:author="Gottfried Zimmermann" w:date="2026-06-26T15:54:00Z" w16du:dateUtc="2026-06-26T13:54:00Z">
-        <w:r>
-          <w:rPr>
-            <w:i/>
-            <w:iCs/>
-          </w:rPr>
-          <w:t>6-26</w:t>
-        </w:r>
-      </w:ins>
-      <w:del w:id="3" w:author="Gottfried Zimmermann" w:date="2026-06-26T15:54:00Z" w16du:dateUtc="2026-06-26T13:54:00Z">
-        <w:r>
-          <w:rPr>
-            <w:i/>
-            <w:iCs/>
-          </w:rPr>
-          <w:delText>3-09</w:delText>
-        </w:r>
-      </w:del>
+      <w:r>
+        <w:rPr>
+          <w:i/>
+          <w:iCs/>
+        </w:rPr>
+        <w:t>6-26</w:t>
+      </w:r>
     </w:p>
     <w:p>
       <w:r>
@@ -183,14 +161,12 @@
         </w:rPr>
         <w:t xml:space="preserve">selbst das </w:t>
       </w:r>
-      <w:ins w:id="4" w:author="Gottfried Zimmermann" w:date="2026-06-26T15:55:00Z" w16du:dateUtc="2026-06-26T13:55:00Z">
-        <w:r>
-          <w:rPr>
-            <w:lang w:bidi="th-TH"/>
-          </w:rPr>
-          <w:t xml:space="preserve">entsprechende </w:t>
-        </w:r>
-      </w:ins>
+      <w:r>
+        <w:rPr>
+          <w:lang w:bidi="th-TH"/>
+        </w:rPr>
+        <w:t xml:space="preserve">entsprechende </w:t>
+      </w:r>
       <w:r>
         <w:rPr>
           <w:lang w:bidi="th-TH"/>
@@ -245,22 +221,12 @@
         </w:rPr>
         <w:t>Knowledge</w:t>
       </w:r>
-      <w:ins w:id="5" w:author="Gottfried Zimmermann" w:date="2026-06-26T15:55:00Z" w16du:dateUtc="2026-06-26T13:55:00Z">
-        <w:r>
-          <w:rPr>
-            <w:lang w:bidi="th-TH"/>
-          </w:rPr>
-          <w:t>-</w:t>
-        </w:r>
-      </w:ins>
-      <w:del w:id="6" w:author="Gottfried Zimmermann" w:date="2026-06-26T15:55:00Z" w16du:dateUtc="2026-06-26T13:55:00Z">
-        <w:r>
-          <w:rPr>
-            <w:lang w:bidi="th-TH"/>
-          </w:rPr>
-          <w:delText xml:space="preserve"> </w:delText>
-        </w:r>
-      </w:del>
+      <w:r>
+        <w:rPr>
+          <w:lang w:bidi="th-TH"/>
+        </w:rPr>
+        <w:t>-</w:t>
+      </w:r>
       <w:r>
         <w:rPr>
           <w:lang w:bidi="th-TH"/>
@@ -382,67 +348,31 @@
         </w:rPr>
         <w:t xml:space="preserve"> (kostenlose Registrierung)</w:t>
       </w:r>
-      <w:ins w:id="7" w:author="Gottfried Zimmermann" w:date="2026-06-26T15:55:00Z" w16du:dateUtc="2026-06-26T13:55:00Z">
-        <w:r>
-          <w:rPr>
-            <w:rFonts w:eastAsia="Calibri"/>
-            <w:szCs w:val="28"/>
-            <w:lang w:bidi="th-TH"/>
-          </w:rPr>
-          <w:t>. Die zentrale Prüfungsadministration wird Sie als „Aufsichtsperso</w:t>
-        </w:r>
-      </w:ins>
-      <w:ins w:id="8" w:author="Gottfried Zimmermann" w:date="2026-06-26T15:56:00Z" w16du:dateUtc="2026-06-26T13:56:00Z">
-        <w:r>
-          <w:rPr>
-            <w:rFonts w:eastAsia="Calibri"/>
-            <w:szCs w:val="28"/>
-            <w:lang w:bidi="th-TH"/>
-          </w:rPr>
-          <w:t>n“ einschreiben.</w:t>
-        </w:r>
-      </w:ins>
+      <w:r>
+        <w:rPr>
+          <w:rFonts w:eastAsia="Calibri"/>
+          <w:szCs w:val="28"/>
+          <w:lang w:bidi="th-TH"/>
+        </w:rPr>
+        <w:t>. Die zentrale Prüfungsadministration wird Sie als „Aufsichtsperson“ einschreiben.</w:t>
+      </w:r>
       <w:r>
         <w:rPr>
           <w:lang w:bidi="th-TH"/>
         </w:rPr>
         <w:t xml:space="preserve"> </w:t>
       </w:r>
-      <w:del w:id="9" w:author="Gottfried Zimmermann" w:date="2026-06-26T15:56:00Z" w16du:dateUtc="2026-06-26T13:56:00Z">
-        <w:r>
-          <w:rPr>
-            <w:lang w:bidi="th-TH"/>
-          </w:rPr>
-          <w:delText>und l</w:delText>
-        </w:r>
-      </w:del>
-      <w:ins w:id="10" w:author="Gottfried Zimmermann" w:date="2026-06-26T15:56:00Z" w16du:dateUtc="2026-06-26T13:56:00Z">
-        <w:r>
-          <w:rPr>
-            <w:lang w:bidi="th-TH"/>
-          </w:rPr>
-          <w:t>L</w:t>
-        </w:r>
-      </w:ins>
       <w:r>
         <w:rPr>
           <w:lang w:bidi="th-TH"/>
         </w:rPr>
-        <w:t xml:space="preserve">assen Sie sich eine Einweisung </w:t>
+        <w:t>L</w:t>
       </w:r>
-      <w:del w:id="11" w:author="Gottfried Zimmermann" w:date="2026-06-26T15:56:00Z" w16du:dateUtc="2026-06-26T13:56:00Z">
-        <w:r>
-          <w:rPr>
-            <w:lang w:bidi="th-TH"/>
-          </w:rPr>
-          <w:delText xml:space="preserve">und Admin-Rechte </w:delText>
-        </w:r>
-      </w:del>
       <w:r>
         <w:rPr>
           <w:lang w:bidi="th-TH"/>
         </w:rPr>
-        <w:t>für den Examenskurs geben.</w:t>
+        <w:t>assen Sie sich eine Einweisung für den Examenskurs geben.</w:t>
       </w:r>
     </w:p>
     <w:p>
@@ -496,7 +426,21 @@
         <w:rPr>
           <w:lang w:bidi="th-TH"/>
         </w:rPr>
-        <w:t>Namen und Email-Adressen der Prüflinge</w:t>
+        <w:t xml:space="preserve">Namen und </w:t>
+      </w:r>
+      <w:proofErr w:type="gramStart"/>
+      <w:r>
+        <w:rPr>
+          <w:lang w:bidi="th-TH"/>
+        </w:rPr>
+        <w:t>Email</w:t>
+      </w:r>
+      <w:proofErr w:type="gramEnd"/>
+      <w:r>
+        <w:rPr>
+          <w:lang w:bidi="th-TH"/>
+        </w:rPr>
+        <w:t>-Adressen der Prüflinge</w:t>
       </w:r>
     </w:p>
     <w:p>
@@ -561,11 +505,11 @@
           <w:numId w:val="5"/>
         </w:numPr>
       </w:pPr>
-      <w:bookmarkStart w:id="12" w:name="_Hlk208997530"/>
+      <w:bookmarkStart w:id="0" w:name="_Hlk208997530"/>
       <w:r>
         <w:t>Ggf. benötigte Ausstattung vor Ort (externer Bildschirm, Laptop, etc.).</w:t>
       </w:r>
-      <w:bookmarkEnd w:id="12"/>
+      <w:bookmarkEnd w:id="0"/>
     </w:p>
     <w:p>
       <w:pPr>
@@ -603,49 +547,25 @@
           <w:ilvl w:val="1"/>
           <w:numId w:val="5"/>
         </w:numPr>
-        <w:rPr>
-          <w:del w:id="13" w:author="Gottfried Zimmermann" w:date="2026-06-26T15:57:00Z" w16du:dateUtc="2026-06-26T13:57:00Z"/>
-        </w:rPr>
-      </w:pPr>
-      <w:ins w:id="14" w:author="Gottfried Zimmermann" w:date="2026-06-26T15:57:00Z" w16du:dateUtc="2026-06-26T13:57:00Z">
-        <w:r>
-          <w:rPr>
-            <w:lang w:bidi="th-TH"/>
-          </w:rPr>
-          <w:t xml:space="preserve">Spezifischer </w:t>
-        </w:r>
-      </w:ins>
-      <w:del w:id="15" w:author="Gottfried Zimmermann" w:date="2026-06-26T15:57:00Z" w16du:dateUtc="2026-06-26T13:57:00Z">
-        <w:r>
-          <w:rPr>
-            <w:lang w:bidi="th-TH"/>
-          </w:rPr>
-          <w:delText>Passwort für die Prüfung</w:delText>
-        </w:r>
-      </w:del>
-    </w:p>
-    <w:p>
-      <w:pPr>
-        <w:pStyle w:val="Listenabsatz"/>
-        <w:numPr>
-          <w:ilvl w:val="1"/>
-          <w:numId w:val="5"/>
-        </w:numPr>
-      </w:pPr>
+      </w:pPr>
+      <w:r>
+        <w:rPr>
+          <w:lang w:bidi="th-TH"/>
+        </w:rPr>
+        <w:t xml:space="preserve">Spezifischer </w:t>
+      </w:r>
       <w:r>
         <w:rPr>
           <w:lang w:bidi="th-TH"/>
         </w:rPr>
         <w:t>Einschreibeschlüssel</w:t>
       </w:r>
-      <w:ins w:id="16" w:author="Gottfried Zimmermann" w:date="2026-06-26T15:57:00Z" w16du:dateUtc="2026-06-26T13:57:00Z">
-        <w:r>
-          <w:rPr>
-            <w:lang w:bidi="th-TH"/>
-          </w:rPr>
-          <w:t xml:space="preserve"> für Ihren Prüfungstermin</w:t>
-        </w:r>
-      </w:ins>
+      <w:r>
+        <w:rPr>
+          <w:lang w:bidi="th-TH"/>
+        </w:rPr>
+        <w:t xml:space="preserve"> für Ihren Prüfungstermin</w:t>
+      </w:r>
     </w:p>
     <w:p>
       <w:pPr>
@@ -800,67 +720,15 @@
           <w:numId w:val="5"/>
         </w:numPr>
         <w:rPr>
-          <w:del w:id="17" w:author="Gottfried Zimmermann" w:date="2026-06-26T15:58:00Z" w16du:dateUtc="2026-06-26T13:58:00Z"/>
-          <w:lang w:bidi="th-TH"/>
-        </w:rPr>
-      </w:pPr>
-      <w:del w:id="18" w:author="Gottfried Zimmermann" w:date="2026-06-26T15:58:00Z" w16du:dateUtc="2026-06-26T13:58:00Z">
-        <w:r>
-          <w:rPr>
-            <w:lang w:bidi="th-TH"/>
-          </w:rPr>
-          <w:delText>Am Tag der Prüfung finden Sie das Passwort für die Prüfung im Examenskurs. Wichtig:</w:delText>
-        </w:r>
-        <w:r>
-          <w:delText xml:space="preserve"> </w:delText>
-        </w:r>
-        <w:r>
-          <w:rPr>
-            <w:lang w:bidi="th-TH"/>
-          </w:rPr>
-          <w:delText xml:space="preserve">Das Passwort wird nach jeder Prüfung geändert! </w:delText>
-        </w:r>
-        <w:r>
-          <w:rPr>
-            <w:lang w:bidi="th-TH"/>
-          </w:rPr>
-          <w:delText>Das neue Passwort ist nur während dem Prüfungszeitraum aktiv. B</w:delText>
-        </w:r>
-        <w:r>
-          <w:rPr>
-            <w:lang w:bidi="th-TH"/>
-          </w:rPr>
-          <w:delText xml:space="preserve">itte prüfen Sie rechtzeitig vor Ihrem Prüfungstermin, ob Sie die aktuelle Version haben. </w:delText>
-        </w:r>
-      </w:del>
-    </w:p>
-    <w:p>
-      <w:pPr>
-        <w:pStyle w:val="Listenabsatz"/>
-        <w:numPr>
-          <w:ilvl w:val="0"/>
-          <w:numId w:val="5"/>
-        </w:numPr>
-        <w:rPr>
           <w:lang w:bidi="th-TH"/>
         </w:rPr>
       </w:pPr>
       <w:r>
         <w:t xml:space="preserve">Lesen Sie sich das Merkblatt für Nachteilsausgleiche sowie die Schritt-für-Schritt-Anleitung zum </w:t>
       </w:r>
-      <w:del w:id="19" w:author="Gottfried Zimmermann" w:date="2026-06-26T15:58:00Z" w16du:dateUtc="2026-06-26T13:58:00Z">
-        <w:r>
-          <w:delText>Einstellen</w:delText>
-        </w:r>
-        <w:r>
-          <w:delText xml:space="preserve"> der</w:delText>
-        </w:r>
-      </w:del>
-      <w:ins w:id="20" w:author="Gottfried Zimmermann" w:date="2026-06-26T15:58:00Z" w16du:dateUtc="2026-06-26T13:58:00Z">
-        <w:r>
-          <w:t>Erstellen einer</w:t>
-        </w:r>
-      </w:ins>
+      <w:r>
+        <w:t>Erstellen einer</w:t>
+      </w:r>
       <w:r>
         <w:t xml:space="preserve"> Zeitverlängerung </w:t>
       </w:r>
@@ -944,30 +812,18 @@
         </w:rPr>
         <w:t>Bei einem Antrag auf Nachteilsausgleich den entsprechenden Nachweis einholen</w:t>
       </w:r>
-      <w:ins w:id="21" w:author="Gottfried Zimmermann" w:date="2026-06-26T15:59:00Z" w16du:dateUtc="2026-06-26T13:59:00Z">
-        <w:r>
-          <w:rPr>
-            <w:lang w:bidi="th-TH"/>
-          </w:rPr>
-          <w:t>.</w:t>
-        </w:r>
-      </w:ins>
+      <w:r>
+        <w:rPr>
+          <w:lang w:bidi="th-TH"/>
+        </w:rPr>
+        <w:t>.</w:t>
+      </w:r>
       <w:r>
         <w:rPr>
           <w:lang w:bidi="th-TH"/>
         </w:rPr>
         <w:t xml:space="preserve"> </w:t>
       </w:r>
-      <w:moveFromRangeStart w:id="22" w:author="Gottfried Zimmermann" w:date="2026-06-26T15:59:00Z" w:name="move233382005"/>
-      <w:moveFrom w:id="23" w:author="Gottfried Zimmermann" w:date="2026-06-26T15:59:00Z" w16du:dateUtc="2026-06-26T13:59:00Z">
-        <w:r>
-          <w:rPr>
-            <w:lang w:bidi="th-TH"/>
-          </w:rPr>
-          <w:t>und die Zeitverlängerung im Examenskurs einrichten.</w:t>
-        </w:r>
-      </w:moveFrom>
-      <w:moveFromRangeEnd w:id="22"/>
     </w:p>
     <w:p>
       <w:pPr>
@@ -1139,15 +995,13 @@
           <w:numId w:val="8"/>
         </w:numPr>
       </w:pPr>
-      <w:ins w:id="24" w:author="Gottfried Zimmermann" w:date="2026-06-26T15:59:00Z" w16du:dateUtc="2026-06-26T13:59:00Z">
-        <w:r>
-          <w:rPr>
-            <w:szCs w:val="28"/>
-            <w:lang w:bidi="th-TH"/>
-          </w:rPr>
-          <w:t xml:space="preserve">Link und </w:t>
-        </w:r>
-      </w:ins>
+      <w:r>
+        <w:rPr>
+          <w:szCs w:val="28"/>
+          <w:lang w:bidi="th-TH"/>
+        </w:rPr>
+        <w:t xml:space="preserve">Link und </w:t>
+      </w:r>
       <w:r>
         <w:rPr>
           <w:szCs w:val="28"/>
@@ -1202,9 +1056,6 @@
           <w:ilvl w:val="0"/>
           <w:numId w:val="8"/>
         </w:numPr>
-        <w:rPr>
-          <w:ins w:id="25" w:author="Gottfried Zimmermann" w:date="2026-06-26T15:59:00Z" w16du:dateUtc="2026-06-26T13:59:00Z"/>
-        </w:rPr>
       </w:pPr>
       <w:r>
         <w:rPr>
@@ -1251,48 +1102,18 @@
           <w:numId w:val="8"/>
         </w:numPr>
       </w:pPr>
-      <w:moveToRangeStart w:id="26" w:author="Gottfried Zimmermann" w:date="2026-06-26T15:59:00Z" w:name="move233382005"/>
-      <w:moveTo w:id="27" w:author="Gottfried Zimmermann" w:date="2026-06-26T15:59:00Z" w16du:dateUtc="2026-06-26T13:59:00Z">
-        <w:del w:id="28" w:author="Gottfried Zimmermann" w:date="2026-06-26T16:00:00Z" w16du:dateUtc="2026-06-26T14:00:00Z">
-          <w:r>
-            <w:rPr>
-              <w:lang w:bidi="th-TH"/>
-            </w:rPr>
-            <w:delText xml:space="preserve">und die </w:delText>
-          </w:r>
-        </w:del>
-        <w:r>
-          <w:rPr>
-            <w:lang w:bidi="th-TH"/>
-          </w:rPr>
-          <w:t>Zeitverlängerung</w:t>
-        </w:r>
-      </w:moveTo>
-      <w:ins w:id="29" w:author="Gottfried Zimmermann" w:date="2026-06-26T16:00:00Z" w16du:dateUtc="2026-06-26T14:00:00Z">
-        <w:r>
-          <w:rPr>
-            <w:lang w:bidi="th-TH"/>
-          </w:rPr>
-          <w:t>en für Nachteilsausgleiche</w:t>
-        </w:r>
-      </w:ins>
-      <w:moveTo w:id="30" w:author="Gottfried Zimmermann" w:date="2026-06-26T15:59:00Z" w16du:dateUtc="2026-06-26T13:59:00Z">
-        <w:r>
-          <w:rPr>
-            <w:lang w:bidi="th-TH"/>
-          </w:rPr>
-          <w:t xml:space="preserve"> im Examenskurs einrichten.</w:t>
-        </w:r>
-      </w:moveTo>
-      <w:moveToRangeEnd w:id="26"/>
-      <w:ins w:id="31" w:author="Gottfried Zimmermann" w:date="2026-06-26T16:00:00Z" w16du:dateUtc="2026-06-26T14:00:00Z">
-        <w:r>
-          <w:rPr>
-            <w:lang w:bidi="th-TH"/>
-          </w:rPr>
-          <w:t xml:space="preserve"> Hinweis: Das geht erst, nachdem die entsprechenden Personen dem Examenskurs beigetreten sind.</w:t>
-        </w:r>
-      </w:ins>
+      <w:r>
+        <w:rPr>
+          <w:lang w:bidi="th-TH"/>
+        </w:rPr>
+        <w:t>Zeitverlängerungen für Nachteilsausgleiche im Examenskurs einrichten.</w:t>
+      </w:r>
+      <w:r>
+        <w:rPr>
+          <w:lang w:bidi="th-TH"/>
+        </w:rPr>
+        <w:t xml:space="preserve"> Hinweis: Das geht erst, nachdem die entsprechenden Personen dem Examenskurs beigetreten sind.</w:t>
+      </w:r>
     </w:p>
     <w:p>
       <w:pPr>
@@ -1334,7 +1155,6 @@
           <w:numId w:val="9"/>
         </w:numPr>
         <w:rPr>
-          <w:ins w:id="32" w:author="Gottfried Zimmermann" w:date="2026-06-26T16:02:00Z" w16du:dateUtc="2026-06-26T14:02:00Z"/>
           <w:lang w:bidi="th-TH"/>
         </w:rPr>
       </w:pPr>
@@ -1356,30 +1176,12 @@
           <w:lang w:bidi="th-TH"/>
         </w:rPr>
       </w:pPr>
-      <w:ins w:id="33" w:author="Gottfried Zimmermann" w:date="2026-06-26T16:02:00Z" w16du:dateUtc="2026-06-26T14:02:00Z">
-        <w:r>
-          <w:rPr>
-            <w:lang w:bidi="th-TH"/>
-          </w:rPr>
-          <w:t>Wenn Sie einen Prüfling beim Betrug erwischen (unerlaubte Hilfsmittel, Abschreiben von anderen Prüflingen), ord</w:t>
-        </w:r>
-      </w:ins>
-      <w:ins w:id="34" w:author="Gottfried Zimmermann" w:date="2026-06-26T16:03:00Z" w16du:dateUtc="2026-06-26T14:03:00Z">
-        <w:r>
-          <w:rPr>
-            <w:lang w:bidi="th-TH"/>
-          </w:rPr>
-          <w:t>nen Sie diesen der Gruppe „Betrugsversuch“ zu. Hinweis: Im Examenskurs die Teilnehmerliste anzeigen lassen, dann bei der Person die Gruppe „Betrugsversuch“ einstellen. Ab dann kann diese Person nicht mehr auf das Examen und</w:t>
-        </w:r>
-      </w:ins>
-      <w:ins w:id="35" w:author="Gottfried Zimmermann" w:date="2026-06-26T16:04:00Z" w16du:dateUtc="2026-06-26T14:04:00Z">
-        <w:r>
-          <w:rPr>
-            <w:lang w:bidi="th-TH"/>
-          </w:rPr>
-          <w:t xml:space="preserve"> auf das Kurszertifikat zugreifen. </w:t>
-        </w:r>
-      </w:ins>
+      <w:r>
+        <w:rPr>
+          <w:lang w:bidi="th-TH"/>
+        </w:rPr>
+        <w:t xml:space="preserve">Wenn Sie einen Prüfling beim Betrug erwischen (unerlaubte Hilfsmittel, Abschreiben von anderen Prüflingen), ordnen Sie diesen der Gruppe „Betrugsversuch“ zu. Hinweis: Im Examenskurs die Teilnehmerliste anzeigen lassen, dann bei der Person die Gruppe „Betrugsversuch“ einstellen. Ab dann kann diese Person nicht mehr auf das Examen und auf das Kurszertifikat zugreifen. </w:t>
+      </w:r>
     </w:p>
     <w:p>
       <w:pPr>
@@ -1528,19 +1330,25 @@
           <w:ilvl w:val="0"/>
           <w:numId w:val="10"/>
         </w:numPr>
-        <w:rPr>
-          <w:del w:id="36" w:author="Gottfried Zimmermann" w:date="2026-06-26T16:01:00Z" w16du:dateUtc="2026-06-26T14:01:00Z"/>
-          <w:lang w:bidi="th-TH"/>
-        </w:rPr>
-      </w:pPr>
-      <w:del w:id="37" w:author="Gottfried Zimmermann" w:date="2026-06-26T16:01:00Z" w16du:dateUtc="2026-06-26T14:01:00Z">
-        <w:r>
-          <w:rPr>
-            <w:lang w:bidi="th-TH"/>
-          </w:rPr>
-          <w:delText>Nach Ablauf der Zeit alle Prüflinge auffordern, die elektronische Prüfung abzuschließen (ABSENDEN-Button).</w:delText>
-        </w:r>
-      </w:del>
+      </w:pPr>
+      <w:r>
+        <w:rPr>
+          <w:lang w:bidi="th-TH"/>
+        </w:rPr>
+        <w:t>Auf Feedback-Fragebogen zur Prüfung im Examenskurs hinweisen</w:t>
+      </w:r>
+      <w:r>
+        <w:rPr>
+          <w:lang w:bidi="th-TH"/>
+        </w:rPr>
+        <w:t xml:space="preserve"> (falls vorhanden)</w:t>
+      </w:r>
+      <w:r>
+        <w:rPr>
+          <w:lang w:bidi="th-TH"/>
+        </w:rPr>
+        <w:t>.</w:t>
+      </w:r>
     </w:p>
     <w:p>
       <w:pPr>
@@ -1549,42 +1357,29 @@
           <w:ilvl w:val="0"/>
           <w:numId w:val="10"/>
         </w:numPr>
+        <w:rPr>
+          <w:lang w:bidi="th-TH"/>
+        </w:rPr>
       </w:pPr>
       <w:r>
         <w:rPr>
           <w:lang w:bidi="th-TH"/>
         </w:rPr>
-        <w:t>Auf Feedback-Fragebogen zur Prüfung im Examenskurs hinweisen</w:t>
+        <w:t xml:space="preserve">Unterschriebene Teilnahmeliste und Protokollblatt einscannen und per </w:t>
       </w:r>
+      <w:proofErr w:type="gramStart"/>
       <w:r>
         <w:rPr>
           <w:lang w:bidi="th-TH"/>
         </w:rPr>
-        <w:t xml:space="preserve"> (falls vorhanden)</w:t>
+        <w:t>Email</w:t>
       </w:r>
+      <w:proofErr w:type="gramEnd"/>
       <w:r>
         <w:rPr>
           <w:lang w:bidi="th-TH"/>
         </w:rPr>
-        <w:t>.</w:t>
-      </w:r>
-    </w:p>
-    <w:p>
-      <w:pPr>
-        <w:pStyle w:val="Listenabsatz"/>
-        <w:numPr>
-          <w:ilvl w:val="0"/>
-          <w:numId w:val="10"/>
-        </w:numPr>
-        <w:rPr>
-          <w:lang w:bidi="th-TH"/>
-        </w:rPr>
-      </w:pPr>
-      <w:r>
-        <w:rPr>
-          <w:lang w:bidi="th-TH"/>
-        </w:rPr>
-        <w:t xml:space="preserve">Unterschriebene Teilnahmeliste und Protokollblatt einscannen und per Email an </w:t>
+        <w:t xml:space="preserve"> an </w:t>
       </w:r>
       <w:r>
         <w:rPr>
@@ -1717,14 +1512,12 @@
         </w:rPr>
         <w:t>.</w:t>
       </w:r>
-      <w:ins w:id="38" w:author="Gottfried Zimmermann" w:date="2026-06-26T16:01:00Z" w16du:dateUtc="2026-06-26T14:01:00Z">
-        <w:r>
-          <w:rPr>
-            <w:lang w:bidi="th-TH"/>
-          </w:rPr>
-          <w:t xml:space="preserve"> </w:t>
-        </w:r>
-      </w:ins>
+      <w:r>
+        <w:rPr>
+          <w:lang w:bidi="th-TH"/>
+        </w:rPr>
+        <w:t xml:space="preserve"> </w:t>
+      </w:r>
     </w:p>
     <w:p>
       <w:pPr>
@@ -3333,14 +3126,6 @@
     <w:abstractNumId w:val="5"/>
   </w:num>
 </w:numbering>
-</file>
-
-<file path=word/people.xml><?xml version="1.0" encoding="utf-8"?>
-<w15:people xmlns:wpc="http://schemas.microsoft.com/office/word/2010/wordprocessingCanvas" xmlns:cx="http://schemas.microsoft.com/office/drawing/2014/chartex" xmlns:cx1="http://schemas.microsoft.com/office/drawing/2015/9/8/chartex" xmlns:cx2="http://schemas.microsoft.com/office/drawing/2015/10/21/chartex" xmlns:cx3="http://schemas.microsoft.com/office/drawing/2016/5/9/chartex" xmlns:cx4="http://schemas.microsoft.com/office/drawing/2016/5/10/chartex" xmlns:cx5="http://schemas.microsoft.com/office/drawing/2016/5/11/chartex" xmlns:cx6="http://schemas.microsoft.com/office/drawing/2016/5/12/chartex" xmlns:cx7="http://schemas.microsoft.com/office/drawing/2016/5/13/chartex" xmlns:cx8="http://schemas.microsoft.com/office/drawing/2016/5/14/chartex" xmlns:mc="http://schemas.openxmlformats.org/markup-compatibility/2006" xmlns:aink="http://schemas.microsoft.com/office/drawing/2016/ink" xmlns:am3d="http://schemas.microsoft.com/office/drawing/2017/model3d" xmlns:o="urn:schemas-microsoft-com:office:office" xmlns:oel="http://schemas.microsoft.com/office/2019/extlst" xmlns:r="http://schemas.openxmlformats.org/officeDocument/2006/relationships" xmlns:m="http://schemas.openxmlformats.org/officeDocument/2006/math" xmlns:v="urn:schemas-microsoft-com:vml" xmlns:wp14="http://schemas.microsoft.com/office/word/2010/wordprocessingDrawing" xmlns:wp="http://schemas.openxmlformats.org/drawingml/2006/wordprocessingDrawing" xmlns:w10="urn:schemas-microsoft-com:office:word" xmlns:w="http://schemas.openxmlformats.org/wordprocessingml/2006/main" xmlns:w14="http://schemas.microsoft.com/office/word/2010/wordml" xmlns:w15="http://schemas.microsoft.com/office/word/2012/wordml" xmlns:w16cex="http://schemas.microsoft.com/office/word/2018/wordml/cex" xmlns:w16cid="http://schemas.microsoft.com/office/word/2016/wordml/cid" xmlns:w16="http://schemas.microsoft.com/office/word/2018/wordml" xmlns:w16du="http://schemas.microsoft.com/office/word/2023/wordml/word16du" xmlns:w16sdtdh="http://schemas.microsoft.com/office/word/2020/wordml/sdtdatahash" xmlns:w16sdtfl="http://schemas.microsoft.com/office/word/2024/wordml/sdtformatlock" xmlns:w16se="http://schemas.microsoft.com/office/word/2015/wordml/symex" xmlns:wpg="http://schemas.microsoft.com/office/word/2010/wordprocessingGroup" xmlns:wpi="http://schemas.microsoft.com/office/word/2010/wordprocessingInk" xmlns:wne="http://schemas.microsoft.com/office/word/2006/wordml" xmlns:wps="http://schemas.microsoft.com/office/word/2010/wordprocessingShape" mc:Ignorable="w14 w15 w16se w16cid w16 w16cex w16sdtdh w16sdtfl w16du wp14">
-  <w15:person w15:author="Gottfried Zimmermann">
-    <w15:presenceInfo w15:providerId="Windows Live" w15:userId="89dddc6042953ddf"/>
-  </w15:person>
-</w15:people>
 </file>
 
 <file path=word/styles.xml><?xml version="1.0" encoding="utf-8"?>

</xml_diff>